<commit_message>
feat: optimize light mode colors, cards, responsive mobile/tablet layout, and floating navbar
</commit_message>
<xml_diff>
--- a/djeridi-mahdi-cv.docx
+++ b/djeridi-mahdi-cv.docx
@@ -76,7 +76,7 @@
                 <w:sz w:val="17"/>
                 <w:szCs w:val="17"/>
               </w:rPr>
-              <w:t xml:space="preserve">FULL STACK &amp; AI ENGINEER · DEVOPS SPECIALIST</w:t>
+              <w:t xml:space="preserve">FULL STACK &amp; AI ENGINEER · CORE BANKING (CBS) · DEVOPS</w:t>
             </w:r>
           </w:p>
           <w:p>
@@ -90,7 +90,7 @@
                 <w:sz w:val="16"/>
                 <w:szCs w:val="16"/>
               </w:rPr>
-              <w:t xml:space="preserve">Conception d'applications web scalables, d'architectures IA autonomes, de systèmes haute performance &amp; workflows DevOps.</w:t>
+              <w:t xml:space="preserve">Conception d'applications web scalables, intégration Core Banking (Temenos &amp; SYBU), architectures IA &amp; systèmes haute performance.</w:t>
             </w:r>
           </w:p>
         </w:tc>
@@ -326,6 +326,96 @@
                 <w:sz w:val="18"/>
                 <w:szCs w:val="18"/>
               </w:rPr>
+              <w:t xml:space="preserve">Core Banking: </w:t>
+            </w:r>
+            <w:r>
+              <w:rPr>
+                <w:rFonts w:ascii="Arial" w:cs="Arial" w:eastAsia="Arial" w:hAnsi="Arial"/>
+                <w:color w:val="334155"/>
+                <w:sz w:val="18"/>
+                <w:szCs w:val="18"/>
+              </w:rPr>
+              <w:t xml:space="preserve">CBS Temenos, CBS SYBU (Legacy), Monétique bancaire, CDR (Centrale des Risques), Centrale des Impayés, Déploiement Data Center</w:t>
+            </w:r>
+          </w:p>
+          <w:p>
+            <w:pPr>
+              <w:pStyle w:val="ListParagraph"/>
+              <w:numPr>
+                <w:ilvl w:val="0"/>
+                <w:numId w:val="1"/>
+              </w:numPr>
+              <w:spacing w:after="4" w:before="4"/>
+            </w:pPr>
+            <w:r>
+              <w:rPr>
+                <w:rFonts w:ascii="Arial" w:cs="Arial" w:eastAsia="Arial" w:hAnsi="Arial"/>
+                <w:b/>
+                <w:bCs/>
+                <w:color w:val="0F172A"/>
+                <w:sz w:val="18"/>
+                <w:szCs w:val="18"/>
+              </w:rPr>
+              <w:t xml:space="preserve">SQL Server &amp; BDD: </w:t>
+            </w:r>
+            <w:r>
+              <w:rPr>
+                <w:rFonts w:ascii="Arial" w:cs="Arial" w:eastAsia="Arial" w:hAnsi="Arial"/>
+                <w:color w:val="334155"/>
+                <w:sz w:val="18"/>
+                <w:szCs w:val="18"/>
+              </w:rPr>
+              <w:t xml:space="preserve">SQL Server (T-SQL), Procédures stockées complexes, Indexation avancée (Clustered/Non-Clustered), Plans d'exécution, PostgreSQL, Redis</w:t>
+            </w:r>
+          </w:p>
+          <w:p>
+            <w:pPr>
+              <w:pStyle w:val="ListParagraph"/>
+              <w:numPr>
+                <w:ilvl w:val="0"/>
+                <w:numId w:val="1"/>
+              </w:numPr>
+              <w:spacing w:after="4" w:before="4"/>
+            </w:pPr>
+            <w:r>
+              <w:rPr>
+                <w:rFonts w:ascii="Arial" w:cs="Arial" w:eastAsia="Arial" w:hAnsi="Arial"/>
+                <w:b/>
+                <w:bCs/>
+                <w:color w:val="0F172A"/>
+                <w:sz w:val="18"/>
+                <w:szCs w:val="18"/>
+              </w:rPr>
+              <w:t xml:space="preserve">Backend: </w:t>
+            </w:r>
+            <w:r>
+              <w:rPr>
+                <w:rFonts w:ascii="Arial" w:cs="Arial" w:eastAsia="Arial" w:hAnsi="Arial"/>
+                <w:color w:val="334155"/>
+                <w:sz w:val="18"/>
+                <w:szCs w:val="18"/>
+              </w:rPr>
+              <w:t xml:space="preserve">ASP.NET Core (C# .NET 8), Node.js, NestJS, Express.js, APIs RESTful, GraphQL, JWT, RBAC, Microservices</w:t>
+            </w:r>
+          </w:p>
+          <w:p>
+            <w:pPr>
+              <w:pStyle w:val="ListParagraph"/>
+              <w:numPr>
+                <w:ilvl w:val="0"/>
+                <w:numId w:val="1"/>
+              </w:numPr>
+              <w:spacing w:after="4" w:before="4"/>
+            </w:pPr>
+            <w:r>
+              <w:rPr>
+                <w:rFonts w:ascii="Arial" w:cs="Arial" w:eastAsia="Arial" w:hAnsi="Arial"/>
+                <w:b/>
+                <w:bCs/>
+                <w:color w:val="0F172A"/>
+                <w:sz w:val="18"/>
+                <w:szCs w:val="18"/>
+              </w:rPr>
               <w:t xml:space="preserve">Frontend: </w:t>
             </w:r>
             <w:r>
@@ -356,36 +446,6 @@
                 <w:sz w:val="18"/>
                 <w:szCs w:val="18"/>
               </w:rPr>
-              <w:t xml:space="preserve">Backend: </w:t>
-            </w:r>
-            <w:r>
-              <w:rPr>
-                <w:rFonts w:ascii="Arial" w:cs="Arial" w:eastAsia="Arial" w:hAnsi="Arial"/>
-                <w:color w:val="334155"/>
-                <w:sz w:val="18"/>
-                <w:szCs w:val="18"/>
-              </w:rPr>
-              <w:t xml:space="preserve">ASP.NET Core (C# .NET 8), Node.js, NestJS, Express.js, APIs RESTful, GraphQL, JWT, RBAC</w:t>
-            </w:r>
-          </w:p>
-          <w:p>
-            <w:pPr>
-              <w:pStyle w:val="ListParagraph"/>
-              <w:numPr>
-                <w:ilvl w:val="0"/>
-                <w:numId w:val="1"/>
-              </w:numPr>
-              <w:spacing w:after="4" w:before="4"/>
-            </w:pPr>
-            <w:r>
-              <w:rPr>
-                <w:rFonts w:ascii="Arial" w:cs="Arial" w:eastAsia="Arial" w:hAnsi="Arial"/>
-                <w:b/>
-                <w:bCs/>
-                <w:color w:val="0F172A"/>
-                <w:sz w:val="18"/>
-                <w:szCs w:val="18"/>
-              </w:rPr>
               <w:t xml:space="preserve">AI &amp; ML: </w:t>
             </w:r>
             <w:r>
@@ -426,36 +486,6 @@
                 <w:szCs w:val="18"/>
               </w:rPr>
               <w:t xml:space="preserve">Docker, Orchestration, CI/CD (GitHub Actions), Linux Admin, Vercel, Azure, Git</w:t>
-            </w:r>
-          </w:p>
-          <w:p>
-            <w:pPr>
-              <w:pStyle w:val="ListParagraph"/>
-              <w:numPr>
-                <w:ilvl w:val="0"/>
-                <w:numId w:val="1"/>
-              </w:numPr>
-              <w:spacing w:after="4" w:before="4"/>
-            </w:pPr>
-            <w:r>
-              <w:rPr>
-                <w:rFonts w:ascii="Arial" w:cs="Arial" w:eastAsia="Arial" w:hAnsi="Arial"/>
-                <w:b/>
-                <w:bCs/>
-                <w:color w:val="0F172A"/>
-                <w:sz w:val="18"/>
-                <w:szCs w:val="18"/>
-              </w:rPr>
-              <w:t xml:space="preserve">Bases de Données: </w:t>
-            </w:r>
-            <w:r>
-              <w:rPr>
-                <w:rFonts w:ascii="Arial" w:cs="Arial" w:eastAsia="Arial" w:hAnsi="Arial"/>
-                <w:color w:val="334155"/>
-                <w:sz w:val="18"/>
-                <w:szCs w:val="18"/>
-              </w:rPr>
-              <w:t xml:space="preserve">SQL Server, PostgreSQL, Redis, Modélisation relationnelle, Procédures stockées</w:t>
             </w:r>
           </w:p>
           <w:p>
@@ -596,7 +626,45 @@
                 <w:sz w:val="18"/>
                 <w:szCs w:val="18"/>
               </w:rPr>
-              <w:t xml:space="preserve">Architecture Système &amp; Systèmes Financiers Bancaires</w:t>
+              <w:t xml:space="preserve">Architecture Core Banking &amp; Systèmes Financiers</w:t>
+            </w:r>
+          </w:p>
+          <w:p>
+            <w:pPr>
+              <w:pStyle w:val="ListParagraph"/>
+              <w:numPr>
+                <w:ilvl w:val="0"/>
+                <w:numId w:val="1"/>
+              </w:numPr>
+              <w:spacing w:after="4" w:before="4"/>
+            </w:pPr>
+            <w:r>
+              <w:rPr>
+                <w:rFonts w:ascii="Arial" w:cs="Arial" w:eastAsia="Arial" w:hAnsi="Arial"/>
+                <w:color w:val="334155"/>
+                <w:sz w:val="18"/>
+                <w:szCs w:val="18"/>
+              </w:rPr>
+              <w:t xml:space="preserve">Optimisation SQL Server, Indexation &amp; Plans d'Exécution</w:t>
+            </w:r>
+          </w:p>
+          <w:p>
+            <w:pPr>
+              <w:pStyle w:val="ListParagraph"/>
+              <w:numPr>
+                <w:ilvl w:val="0"/>
+                <w:numId w:val="1"/>
+              </w:numPr>
+              <w:spacing w:after="4" w:before="4"/>
+            </w:pPr>
+            <w:r>
+              <w:rPr>
+                <w:rFonts w:ascii="Arial" w:cs="Arial" w:eastAsia="Arial" w:hAnsi="Arial"/>
+                <w:color w:val="334155"/>
+                <w:sz w:val="18"/>
+                <w:szCs w:val="18"/>
+              </w:rPr>
+              <w:t xml:space="preserve">Déploiement Haute Disponibilité en Data Center</w:t>
             </w:r>
           </w:p>
           <w:p>
@@ -616,44 +684,6 @@
                 <w:szCs w:val="18"/>
               </w:rPr>
               <w:t xml:space="preserve">Intelligence Artificielle, RAG &amp; Agents Autonomes</w:t>
-            </w:r>
-          </w:p>
-          <w:p>
-            <w:pPr>
-              <w:pStyle w:val="ListParagraph"/>
-              <w:numPr>
-                <w:ilvl w:val="0"/>
-                <w:numId w:val="1"/>
-              </w:numPr>
-              <w:spacing w:after="4" w:before="4"/>
-            </w:pPr>
-            <w:r>
-              <w:rPr>
-                <w:rFonts w:ascii="Arial" w:cs="Arial" w:eastAsia="Arial" w:hAnsi="Arial"/>
-                <w:color w:val="334155"/>
-                <w:sz w:val="18"/>
-                <w:szCs w:val="18"/>
-              </w:rPr>
-              <w:t xml:space="preserve">Graphismes WebGL 3D &amp; Interfaces Immersives</w:t>
-            </w:r>
-          </w:p>
-          <w:p>
-            <w:pPr>
-              <w:pStyle w:val="ListParagraph"/>
-              <w:numPr>
-                <w:ilvl w:val="0"/>
-                <w:numId w:val="1"/>
-              </w:numPr>
-              <w:spacing w:after="4" w:before="4"/>
-            </w:pPr>
-            <w:r>
-              <w:rPr>
-                <w:rFonts w:ascii="Arial" w:cs="Arial" w:eastAsia="Arial" w:hAnsi="Arial"/>
-                <w:color w:val="334155"/>
-                <w:sz w:val="18"/>
-                <w:szCs w:val="18"/>
-              </w:rPr>
-              <w:t xml:space="preserve">High Performance Computing &amp; Cloud Automation</w:t>
             </w:r>
           </w:p>
           <w:p>
@@ -670,6 +700,52 @@
                 <w:szCs w:val="20"/>
               </w:rPr>
               <w:t xml:space="preserve">F   O   R   M   A   T   I   O   N</w:t>
+            </w:r>
+          </w:p>
+          <w:p>
+            <w:pPr>
+              <w:spacing w:after="2" w:before="10"/>
+            </w:pPr>
+            <w:r>
+              <w:rPr>
+                <w:rFonts w:ascii="Arial" w:cs="Arial" w:eastAsia="Arial" w:hAnsi="Arial"/>
+                <w:b/>
+                <w:bCs/>
+                <w:color w:val="0F172A"/>
+                <w:sz w:val="18"/>
+                <w:szCs w:val="18"/>
+              </w:rPr>
+              <w:t xml:space="preserve">FORMATION CBS &amp; DATA CENTER</w:t>
+            </w:r>
+          </w:p>
+          <w:p>
+            <w:pPr>
+              <w:spacing w:after="2" w:before="0"/>
+            </w:pPr>
+            <w:r>
+              <w:rPr>
+                <w:rFonts w:ascii="Arial" w:cs="Arial" w:eastAsia="Arial" w:hAnsi="Arial"/>
+                <w:color w:val="334155"/>
+                <w:sz w:val="17"/>
+                <w:szCs w:val="17"/>
+              </w:rPr>
+              <w:t xml:space="preserve">2025 - 2026</w:t>
+            </w:r>
+          </w:p>
+          <w:p>
+            <w:pPr>
+              <w:spacing w:after="8" w:before="0"/>
+            </w:pPr>
+            <w:r>
+              <w:rPr>
+                <w:rFonts w:ascii="Arial" w:cs="Arial" w:eastAsia="Arial" w:hAnsi="Arial"/>
+                <w:i/>
+                <w:iCs/>
+                <w:color w:val="64748B"/>
+                <w:sz w:val="17"/>
+                <w:szCs w:val="17"/>
+              </w:rPr>
+              <w:t xml:space="preserve">Installation &amp; Déploiement d'Environnements CBS en Data Center Bancaire</w:t>
             </w:r>
           </w:p>
           <w:p>
@@ -853,7 +929,7 @@
                 <w:sz w:val="19"/>
                 <w:szCs w:val="19"/>
               </w:rPr>
-              <w:t xml:space="preserve">INGÉNIEUR DÉVELOPPEUR FULL STACK - BNH - BANQUE NATIONALE D'HABITAT</w:t>
+              <w:t xml:space="preserve">INGÉNIEUR CORE BANKING &amp; DÉVELOPPEUR FULL STACK - BNH - BANQUE NATIONALE D'HABITAT</w:t>
             </w:r>
           </w:p>
           <w:p>
@@ -890,136 +966,106 @@
                 <w:sz w:val="18"/>
                 <w:szCs w:val="18"/>
               </w:rPr>
-              <w:t xml:space="preserve">Système Monétique &amp; Flux: </w:t>
-            </w:r>
-            <w:r>
-              <w:rPr>
-                <w:rFonts w:ascii="Arial" w:cs="Arial" w:eastAsia="Arial" w:hAnsi="Arial"/>
-                <w:color w:val="334155"/>
-                <w:sz w:val="18"/>
-                <w:szCs w:val="18"/>
-              </w:rPr>
-              <w:t xml:space="preserve">Développement et intégration de sous-systèmes monétiques pour le traitement sécurisé des transactions et cartes bancaires.</w:t>
-            </w:r>
-          </w:p>
-          <w:p>
-            <w:pPr>
-              <w:pStyle w:val="ListParagraph"/>
-              <w:numPr>
-                <w:ilvl w:val="0"/>
-                <w:numId w:val="1"/>
-              </w:numPr>
-              <w:spacing w:after="4" w:before="4"/>
-            </w:pPr>
-            <w:r>
-              <w:rPr>
-                <w:rFonts w:ascii="Arial" w:cs="Arial" w:eastAsia="Arial" w:hAnsi="Arial"/>
-                <w:b/>
-                <w:bCs/>
-                <w:color w:val="0F172A"/>
-                <w:sz w:val="18"/>
-                <w:szCs w:val="18"/>
-              </w:rPr>
-              <w:t xml:space="preserve">Reporting &amp; Dashboards: </w:t>
-            </w:r>
-            <w:r>
-              <w:rPr>
-                <w:rFonts w:ascii="Arial" w:cs="Arial" w:eastAsia="Arial" w:hAnsi="Arial"/>
-                <w:color w:val="334155"/>
-                <w:sz w:val="18"/>
-                <w:szCs w:val="18"/>
-              </w:rPr>
-              <w:t xml:space="preserve">Conception de modules de reporting automatisés et tableaux de bord décisionnels pour la direction bancaire.</w:t>
-            </w:r>
-          </w:p>
-          <w:p>
-            <w:pPr>
-              <w:pStyle w:val="ListParagraph"/>
-              <w:numPr>
-                <w:ilvl w:val="0"/>
-                <w:numId w:val="1"/>
-              </w:numPr>
-              <w:spacing w:after="4" w:before="4"/>
-            </w:pPr>
-            <w:r>
-              <w:rPr>
-                <w:rFonts w:ascii="Arial" w:cs="Arial" w:eastAsia="Arial" w:hAnsi="Arial"/>
-                <w:b/>
-                <w:bCs/>
-                <w:color w:val="0F172A"/>
-                <w:sz w:val="18"/>
-                <w:szCs w:val="18"/>
-              </w:rPr>
-              <w:t xml:space="preserve">Central des Risques: </w:t>
-            </w:r>
-            <w:r>
-              <w:rPr>
-                <w:rFonts w:ascii="Arial" w:cs="Arial" w:eastAsia="Arial" w:hAnsi="Arial"/>
-                <w:color w:val="334155"/>
-                <w:sz w:val="18"/>
-                <w:szCs w:val="18"/>
-              </w:rPr>
-              <w:t xml:space="preserve">Architecture et développement du système national de centralisation, d'analyse et de contrôle des risques de crédit bancaires.</w:t>
-            </w:r>
-          </w:p>
-          <w:p>
-            <w:pPr>
-              <w:pStyle w:val="ListParagraph"/>
-              <w:numPr>
-                <w:ilvl w:val="0"/>
-                <w:numId w:val="1"/>
-              </w:numPr>
-              <w:spacing w:after="4" w:before="4"/>
-            </w:pPr>
-            <w:r>
-              <w:rPr>
-                <w:rFonts w:ascii="Arial" w:cs="Arial" w:eastAsia="Arial" w:hAnsi="Arial"/>
-                <w:b/>
-                <w:bCs/>
-                <w:color w:val="0F172A"/>
-                <w:sz w:val="18"/>
-                <w:szCs w:val="18"/>
-              </w:rPr>
-              <w:t xml:space="preserve">Centrale des Impayés: </w:t>
-            </w:r>
-            <w:r>
-              <w:rPr>
-                <w:rFonts w:ascii="Arial" w:cs="Arial" w:eastAsia="Arial" w:hAnsi="Arial"/>
-                <w:color w:val="334155"/>
-                <w:sz w:val="18"/>
-                <w:szCs w:val="18"/>
-              </w:rPr>
-              <w:t xml:space="preserve">Développement de la solution d'identification, de suivi et de gestion automatisée des créances et impayés bancaires.</w:t>
-            </w:r>
-          </w:p>
-          <w:p>
-            <w:pPr>
-              <w:pStyle w:val="ListParagraph"/>
-              <w:numPr>
-                <w:ilvl w:val="0"/>
-                <w:numId w:val="1"/>
-              </w:numPr>
-              <w:spacing w:after="4" w:before="4"/>
-            </w:pPr>
-            <w:r>
-              <w:rPr>
-                <w:rFonts w:ascii="Arial" w:cs="Arial" w:eastAsia="Arial" w:hAnsi="Arial"/>
-                <w:b/>
-                <w:bCs/>
-                <w:color w:val="0F172A"/>
-                <w:sz w:val="18"/>
-                <w:szCs w:val="18"/>
-              </w:rPr>
-              <w:t xml:space="preserve">APIs C# &amp; SQL Server: </w:t>
-            </w:r>
-            <w:r>
-              <w:rPr>
-                <w:rFonts w:ascii="Arial" w:cs="Arial" w:eastAsia="Arial" w:hAnsi="Arial"/>
-                <w:color w:val="334155"/>
-                <w:sz w:val="18"/>
-                <w:szCs w:val="18"/>
-              </w:rPr>
-              <w:t xml:space="preserve">APIs hautes performances en ASP.NET Core (C#), sécurité JWT/RBAC, procédures stockées complexes et requêtes optimisées.</w:t>
+              <w:t xml:space="preserve">Modernisation &amp; CBS Temenos: </w:t>
+            </w:r>
+            <w:r>
+              <w:rPr>
+                <w:rFonts w:ascii="Arial" w:cs="Arial" w:eastAsia="Arial" w:hAnsi="Arial"/>
+                <w:color w:val="334155"/>
+                <w:sz w:val="18"/>
+                <w:szCs w:val="18"/>
+              </w:rPr>
+              <w:t xml:space="preserve">Participation active aux travaux de transition et d'implémentation du nouveau Core Banking System Temenos ; analyse des spécifications techniques et fonctionnelles, cartographie des flux d'interfaçage et intégration des modules périphériques.</w:t>
+            </w:r>
+          </w:p>
+          <w:p>
+            <w:pPr>
+              <w:pStyle w:val="ListParagraph"/>
+              <w:numPr>
+                <w:ilvl w:val="0"/>
+                <w:numId w:val="1"/>
+              </w:numPr>
+              <w:spacing w:after="4" w:before="4"/>
+            </w:pPr>
+            <w:r>
+              <w:rPr>
+                <w:rFonts w:ascii="Arial" w:cs="Arial" w:eastAsia="Arial" w:hAnsi="Arial"/>
+                <w:b/>
+                <w:bCs/>
+                <w:color w:val="0F172A"/>
+                <w:sz w:val="18"/>
+                <w:szCs w:val="18"/>
+              </w:rPr>
+              <w:t xml:space="preserve">Satellites CBS SYBU (Monétique, CDR, Impayés): </w:t>
+            </w:r>
+            <w:r>
+              <w:rPr>
+                <w:rFonts w:ascii="Arial" w:cs="Arial" w:eastAsia="Arial" w:hAnsi="Arial"/>
+                <w:color w:val="334155"/>
+                <w:sz w:val="18"/>
+                <w:szCs w:val="18"/>
+              </w:rPr>
+              <w:t xml:space="preserve">Développement et interconnexion d’applications connexes permettant d’exploiter et d’échanger les données avec l'ancien Core Banking (SYBU) : flux monétiques (cartes, DAB), Centrale des Risques (CDR) et Centrale des Impayés.</w:t>
+            </w:r>
+          </w:p>
+          <w:p>
+            <w:pPr>
+              <w:pStyle w:val="ListParagraph"/>
+              <w:numPr>
+                <w:ilvl w:val="0"/>
+                <w:numId w:val="1"/>
+              </w:numPr>
+              <w:spacing w:after="4" w:before="4"/>
+            </w:pPr>
+            <w:r>
+              <w:rPr>
+                <w:rFonts w:ascii="Arial" w:cs="Arial" w:eastAsia="Arial" w:hAnsi="Arial"/>
+                <w:b/>
+                <w:bCs/>
+                <w:color w:val="0F172A"/>
+                <w:sz w:val="18"/>
+                <w:szCs w:val="18"/>
+              </w:rPr>
+              <w:t xml:space="preserve">SQL Server (T-SQL) &amp; Performance: </w:t>
+            </w:r>
+            <w:r>
+              <w:rPr>
+                <w:rFonts w:ascii="Arial" w:cs="Arial" w:eastAsia="Arial" w:hAnsi="Arial"/>
+                <w:color w:val="334155"/>
+                <w:sz w:val="18"/>
+                <w:szCs w:val="18"/>
+              </w:rPr>
+              <w:t xml:space="preserve">Conception de procédures stockées complexes, fonctions et transactions ACID ; stratégies d'indexation avancée (index clusterisés, non-clusterisés et composites) pour requêtes volumineuses ; analyse fine des plans d'exécution (Execution Plans) et tuning de performance sur les flux financiers.</w:t>
+            </w:r>
+          </w:p>
+          <w:p>
+            <w:pPr>
+              <w:pStyle w:val="ListParagraph"/>
+              <w:numPr>
+                <w:ilvl w:val="0"/>
+                <w:numId w:val="1"/>
+              </w:numPr>
+              <w:spacing w:after="4" w:before="4"/>
+            </w:pPr>
+            <w:r>
+              <w:rPr>
+                <w:rFonts w:ascii="Arial" w:cs="Arial" w:eastAsia="Arial" w:hAnsi="Arial"/>
+                <w:b/>
+                <w:bCs/>
+                <w:color w:val="0F172A"/>
+                <w:sz w:val="18"/>
+                <w:szCs w:val="18"/>
+              </w:rPr>
+              <w:t xml:space="preserve">APIs C# (.NET 8): </w:t>
+            </w:r>
+            <w:r>
+              <w:rPr>
+                <w:rFonts w:ascii="Arial" w:cs="Arial" w:eastAsia="Arial" w:hAnsi="Arial"/>
+                <w:color w:val="334155"/>
+                <w:sz w:val="18"/>
+                <w:szCs w:val="18"/>
+              </w:rPr>
+              <w:t xml:space="preserve">Architecture d'APIs sécurisées en ASP.NET Core (C# .NET 8), sécurité JWT/RBAC et interconnexion haute performance avec les bases SQL Server.</w:t>
             </w:r>
           </w:p>
           <w:p>

</xml_diff>